<commit_message>
Add publishing workspace and capture draft wording tweaks
</commit_message>
<xml_diff>
--- a/Lean and Agile.docx
+++ b/Lean and Agile.docx
@@ -88,6 +88,11 @@
       </w:r>
       <w:commentRangeEnd w:id="0"/>
       <w:r>
+        <w:rPr>
+          <w:rStyle w:val="CommentReference"/>
+          <w:sz w:val="22"/>
+          <w:szCs w:val="22"/>
+        </w:rPr>
         <w:commentReference w:id="0"/>
       </w:r>
     </w:p>
@@ -124,6 +129,12 @@
       </w:r>
       <w:commentRangeEnd w:id="1"/>
       <w:r>
+        <w:rPr>
+          <w:rStyle w:val="CommentReference"/>
+          <w:rFonts w:ascii="Cambria" w:eastAsia="Cambria" w:hAnsi="Cambria" w:cs="Cambria"/>
+          <w:sz w:val="22"/>
+          <w:szCs w:val="22"/>
+        </w:rPr>
         <w:commentReference w:id="1"/>
       </w:r>
     </w:p>
@@ -193,6 +204,11 @@
       </w:r>
       <w:commentRangeEnd w:id="2"/>
       <w:r>
+        <w:rPr>
+          <w:rStyle w:val="CommentReference"/>
+          <w:sz w:val="22"/>
+          <w:szCs w:val="22"/>
+        </w:rPr>
         <w:commentReference w:id="2"/>
       </w:r>
     </w:p>
@@ -201,23 +217,7 @@
         <w:spacing w:before="240" w:after="240"/>
       </w:pPr>
       <w:r>
-        <w:t xml:space="preserve">But what happens when all three collide in the modern organization? Often, companies find themselves picking and choosing elements from each methodology, creating hybrids that aren’t always harmonious. Lean might clash with </w:t>
-      </w:r>
-      <w:proofErr w:type="spellStart"/>
-      <w:r>
-        <w:t>Agile’s</w:t>
-      </w:r>
-      <w:proofErr w:type="spellEnd"/>
-      <w:r>
-        <w:t xml:space="preserve"> focus on rapid iteration, while ITIL’s need for control can feel at odds with </w:t>
-      </w:r>
-      <w:proofErr w:type="spellStart"/>
-      <w:r>
-        <w:t>Agile’s</w:t>
-      </w:r>
-      <w:proofErr w:type="spellEnd"/>
-      <w:r>
-        <w:t xml:space="preserve"> emphasis on adaptability. These clashes aren’t just theoretical; they often reflect the personality types and preferences of the people implementing them.</w:t>
+        <w:t>But what happens when all three collide in the modern organization? Often, companies find themselves picking and choosing elements from each methodology, creating hybrids that aren’t always harmonious. Lean might clash with Agile’s focus on rapid iteration, while ITIL’s need for control can feel at odds with Agile’s emphasis on adaptability. These clashes aren’t just theoretical; they often reflect the personality types and preferences of the people implementing them.</w:t>
       </w:r>
     </w:p>
     <w:p>
@@ -231,12 +231,19 @@
       </w:r>
       <w:commentRangeEnd w:id="3"/>
       <w:r>
+        <w:rPr>
+          <w:rStyle w:val="CommentReference"/>
+          <w:sz w:val="22"/>
+          <w:szCs w:val="22"/>
+        </w:rPr>
         <w:commentReference w:id="3"/>
       </w:r>
       <w:commentRangeEnd w:id="4"/>
       <w:r>
         <w:rPr>
           <w:rStyle w:val="CommentReference"/>
+          <w:sz w:val="22"/>
+          <w:szCs w:val="22"/>
         </w:rPr>
         <w:commentReference w:id="4"/>
       </w:r>
@@ -294,6 +301,8 @@
       <w:r>
         <w:rPr>
           <w:rStyle w:val="CommentReference"/>
+          <w:sz w:val="22"/>
+          <w:szCs w:val="22"/>
         </w:rPr>
         <w:commentReference w:id="5"/>
       </w:r>
@@ -339,6 +348,8 @@
       <w:r>
         <w:rPr>
           <w:rStyle w:val="CommentReference"/>
+          <w:sz w:val="22"/>
+          <w:szCs w:val="22"/>
         </w:rPr>
         <w:commentReference w:id="6"/>
       </w:r>
@@ -346,6 +357,8 @@
       <w:r>
         <w:rPr>
           <w:rStyle w:val="CommentReference"/>
+          <w:sz w:val="22"/>
+          <w:szCs w:val="22"/>
         </w:rPr>
         <w:commentReference w:id="7"/>
       </w:r>
@@ -469,6 +482,12 @@
       </w:r>
       <w:commentRangeEnd w:id="8"/>
       <w:r>
+        <w:rPr>
+          <w:rStyle w:val="CommentReference"/>
+          <w:color w:val="FF0000"/>
+          <w:sz w:val="22"/>
+          <w:szCs w:val="22"/>
+        </w:rPr>
         <w:commentReference w:id="8"/>
       </w:r>
     </w:p>
@@ -507,6 +526,11 @@
       </w:r>
       <w:commentRangeEnd w:id="9"/>
       <w:r>
+        <w:rPr>
+          <w:rStyle w:val="CommentReference"/>
+          <w:sz w:val="22"/>
+          <w:szCs w:val="22"/>
+        </w:rPr>
         <w:commentReference w:id="9"/>
       </w:r>
     </w:p>
@@ -530,6 +554,11 @@
       </w:r>
       <w:commentRangeEnd w:id="10"/>
       <w:r>
+        <w:rPr>
+          <w:rStyle w:val="CommentReference"/>
+          <w:sz w:val="22"/>
+          <w:szCs w:val="22"/>
+        </w:rPr>
         <w:commentReference w:id="10"/>
       </w:r>
       <w:r>
@@ -648,6 +677,11 @@
       </w:r>
       <w:commentRangeEnd w:id="11"/>
       <w:r>
+        <w:rPr>
+          <w:rStyle w:val="CommentReference"/>
+          <w:sz w:val="22"/>
+          <w:szCs w:val="22"/>
+        </w:rPr>
         <w:commentReference w:id="11"/>
       </w:r>
       <w:r>
@@ -697,6 +731,11 @@
       </w:r>
       <w:commentRangeEnd w:id="12"/>
       <w:r>
+        <w:rPr>
+          <w:rStyle w:val="CommentReference"/>
+          <w:sz w:val="22"/>
+          <w:szCs w:val="22"/>
+        </w:rPr>
         <w:commentReference w:id="12"/>
       </w:r>
       <w:r>
@@ -714,6 +753,11 @@
       </w:r>
       <w:commentRangeEnd w:id="13"/>
       <w:r>
+        <w:rPr>
+          <w:rStyle w:val="CommentReference"/>
+          <w:sz w:val="22"/>
+          <w:szCs w:val="22"/>
+        </w:rPr>
         <w:commentReference w:id="13"/>
       </w:r>
       <w:r>
@@ -782,12 +826,19 @@
       </w:r>
       <w:commentRangeEnd w:id="14"/>
       <w:r>
+        <w:rPr>
+          <w:rStyle w:val="CommentReference"/>
+          <w:sz w:val="22"/>
+          <w:szCs w:val="22"/>
+        </w:rPr>
         <w:commentReference w:id="14"/>
       </w:r>
       <w:commentRangeEnd w:id="15"/>
       <w:r>
         <w:rPr>
           <w:rStyle w:val="CommentReference"/>
+          <w:sz w:val="22"/>
+          <w:szCs w:val="22"/>
         </w:rPr>
         <w:commentReference w:id="15"/>
       </w:r>
@@ -914,6 +965,11 @@
       </w:r>
       <w:commentRangeEnd w:id="16"/>
       <w:r>
+        <w:rPr>
+          <w:rStyle w:val="CommentReference"/>
+          <w:sz w:val="22"/>
+          <w:szCs w:val="22"/>
+        </w:rPr>
         <w:commentReference w:id="16"/>
       </w:r>
       <w:r>
@@ -987,6 +1043,11 @@
       </w:r>
       <w:commentRangeEnd w:id="17"/>
       <w:r>
+        <w:rPr>
+          <w:rStyle w:val="CommentReference"/>
+          <w:sz w:val="22"/>
+          <w:szCs w:val="22"/>
+        </w:rPr>
         <w:commentReference w:id="17"/>
       </w:r>
     </w:p>
@@ -1094,12 +1155,19 @@
       </w:r>
       <w:commentRangeEnd w:id="18"/>
       <w:r>
+        <w:rPr>
+          <w:rStyle w:val="CommentReference"/>
+          <w:sz w:val="22"/>
+          <w:szCs w:val="22"/>
+        </w:rPr>
         <w:commentReference w:id="18"/>
       </w:r>
       <w:commentRangeEnd w:id="19"/>
       <w:r>
         <w:rPr>
           <w:rStyle w:val="CommentReference"/>
+          <w:sz w:val="22"/>
+          <w:szCs w:val="22"/>
         </w:rPr>
         <w:commentReference w:id="19"/>
       </w:r>
@@ -1227,15 +1295,7 @@
         <w:t>Agile</w:t>
       </w:r>
       <w:r>
-        <w:t xml:space="preserve">: </w:t>
-      </w:r>
-      <w:proofErr w:type="spellStart"/>
-      <w:r>
-        <w:t>Agile’s</w:t>
-      </w:r>
-      <w:proofErr w:type="spellEnd"/>
-      <w:r>
-        <w:t xml:space="preserve"> emphasis on rapid iteration and adaptability may seem at odds with </w:t>
+        <w:t xml:space="preserve">: Agile’s emphasis on rapid iteration and adaptability may seem at odds with </w:t>
       </w:r>
       <w:commentRangeStart w:id="20"/>
       <w:r>
@@ -1243,6 +1303,11 @@
       </w:r>
       <w:commentRangeEnd w:id="20"/>
       <w:r>
+        <w:rPr>
+          <w:rStyle w:val="CommentReference"/>
+          <w:sz w:val="22"/>
+          <w:szCs w:val="22"/>
+        </w:rPr>
         <w:commentReference w:id="20"/>
       </w:r>
       <w:r>
@@ -1284,6 +1349,11 @@
       </w:r>
       <w:commentRangeEnd w:id="21"/>
       <w:r>
+        <w:rPr>
+          <w:rStyle w:val="CommentReference"/>
+          <w:sz w:val="22"/>
+          <w:szCs w:val="22"/>
+        </w:rPr>
         <w:commentReference w:id="21"/>
       </w:r>
     </w:p>
@@ -1344,19 +1414,11 @@
         </w:rPr>
         <w:t xml:space="preserve">, </w:t>
       </w:r>
-      <w:proofErr w:type="spellStart"/>
-      <w:r>
-        <w:rPr>
-          <w:rFonts w:ascii="Cambria" w:eastAsia="Cambria" w:hAnsi="Cambria" w:cs="Cambria"/>
-        </w:rPr>
-        <w:t>BigPanda</w:t>
-      </w:r>
-      <w:proofErr w:type="spellEnd"/>
-      <w:r>
-        <w:rPr>
-          <w:rFonts w:ascii="Cambria" w:eastAsia="Cambria" w:hAnsi="Cambria" w:cs="Cambria"/>
-        </w:rPr>
-        <w:t xml:space="preserve">, </w:t>
+      <w:r>
+        <w:rPr>
+          <w:rFonts w:ascii="Cambria" w:eastAsia="Cambria" w:hAnsi="Cambria" w:cs="Cambria"/>
+        </w:rPr>
+        <w:t xml:space="preserve">BigPanda, </w:t>
       </w:r>
       <w:r>
         <w:rPr>
@@ -1404,6 +1466,13 @@
       </w:r>
       <w:commentRangeEnd w:id="22"/>
       <w:r>
+        <w:rPr>
+          <w:rStyle w:val="CommentReference"/>
+          <w:i/>
+          <w:iCs/>
+          <w:sz w:val="22"/>
+          <w:szCs w:val="22"/>
+        </w:rPr>
         <w:commentReference w:id="22"/>
       </w:r>
       <w:r>
@@ -2337,12 +2406,21 @@
       </w:r>
       <w:commentRangeEnd w:id="23"/>
       <w:r>
+        <w:rPr>
+          <w:rStyle w:val="CommentReference"/>
+          <w:color w:val="000000" w:themeColor="text1"/>
+          <w:sz w:val="22"/>
+          <w:szCs w:val="22"/>
+        </w:rPr>
         <w:commentReference w:id="23"/>
       </w:r>
       <w:commentRangeEnd w:id="24"/>
       <w:r>
         <w:rPr>
           <w:rStyle w:val="CommentReference"/>
+          <w:color w:val="000000" w:themeColor="text1"/>
+          <w:sz w:val="22"/>
+          <w:szCs w:val="22"/>
         </w:rPr>
         <w:commentReference w:id="24"/>
       </w:r>
@@ -2416,6 +2494,12 @@
       </w:r>
       <w:commentRangeEnd w:id="25"/>
       <w:r>
+        <w:rPr>
+          <w:rStyle w:val="CommentReference"/>
+          <w:color w:val="000000" w:themeColor="text1"/>
+          <w:sz w:val="22"/>
+          <w:szCs w:val="22"/>
+        </w:rPr>
         <w:commentReference w:id="25"/>
       </w:r>
     </w:p>
@@ -2464,33 +2548,11 @@
         </w:rPr>
         <w:t xml:space="preserve"> </w:t>
       </w:r>
-      <w:proofErr w:type="spellStart"/>
       <w:r>
         <w:rPr>
           <w:color w:val="000000" w:themeColor="text1"/>
         </w:rPr>
-        <w:t>Agile’s</w:t>
-      </w:r>
-      <w:proofErr w:type="spellEnd"/>
-      <w:r>
-        <w:rPr>
-          <w:color w:val="000000" w:themeColor="text1"/>
-        </w:rPr>
-        <w:t xml:space="preserve"> iterative model—often utilizing sprints and incremental improvements—aligns well with the need for quick feedback loops. Agile is built on the idea that teams know best how to tackle their specific challenges. Executives establish high-level goals and outcomes, while managers trust the teams to self-organize, adapt, and iterate. </w:t>
-      </w:r>
-      <w:proofErr w:type="spellStart"/>
-      <w:r>
-        <w:rPr>
-          <w:color w:val="000000" w:themeColor="text1"/>
-        </w:rPr>
-        <w:t>Agile’s</w:t>
-      </w:r>
-      <w:proofErr w:type="spellEnd"/>
-      <w:r>
-        <w:rPr>
-          <w:color w:val="000000" w:themeColor="text1"/>
-        </w:rPr>
-        <w:t xml:space="preserve"> technical tools, such as backlog prioritization, user stories, and continuous integration (CI), place the responsibility for quality on each team member, making the process as collaborative as it is iterative. Agile techniques like sprint planning, daily stand-ups, and retrospectives allow teams to continuously refine both product and process, fostering a culture of ownership and psychological safety. </w:t>
+        <w:t xml:space="preserve">Agile’s iterative model—often utilizing sprints and incremental improvements—aligns well with the need for quick feedback loops. Agile is built on the idea that teams know best how to tackle their specific challenges. Executives establish high-level goals and outcomes, while managers trust the teams to self-organize, adapt, and iterate. Agile’s technical tools, such as backlog prioritization, user stories, and continuous integration (CI), place the responsibility for quality on each team member, making the process as collaborative as it is iterative. Agile techniques like sprint planning, daily stand-ups, and retrospectives allow teams to continuously refine both product and process, fostering a culture of ownership and psychological safety. </w:t>
       </w:r>
       <w:r>
         <w:rPr>
@@ -2502,7 +2564,12 @@
       <w:commentRangeEnd w:id="26"/>
       <w:r>
         <w:rPr>
-          <w:strike/>
+          <w:rStyle w:val="CommentReference"/>
+          <w:b/>
+          <w:bCs/>
+          <w:color w:val="000000" w:themeColor="text1"/>
+          <w:sz w:val="22"/>
+          <w:szCs w:val="22"/>
         </w:rPr>
         <w:commentReference w:id="26"/>
       </w:r>
@@ -2510,6 +2577,11 @@
       <w:r>
         <w:rPr>
           <w:rStyle w:val="CommentReference"/>
+          <w:b/>
+          <w:bCs/>
+          <w:color w:val="000000" w:themeColor="text1"/>
+          <w:sz w:val="22"/>
+          <w:szCs w:val="22"/>
         </w:rPr>
         <w:commentReference w:id="27"/>
       </w:r>
@@ -2561,12 +2633,21 @@
       </w:r>
       <w:commentRangeEnd w:id="28"/>
       <w:r>
+        <w:rPr>
+          <w:rStyle w:val="CommentReference"/>
+          <w:color w:val="000000" w:themeColor="text1"/>
+          <w:sz w:val="22"/>
+          <w:szCs w:val="22"/>
+        </w:rPr>
         <w:commentReference w:id="28"/>
       </w:r>
       <w:commentRangeEnd w:id="29"/>
       <w:r>
         <w:rPr>
           <w:rStyle w:val="CommentReference"/>
+          <w:color w:val="000000" w:themeColor="text1"/>
+          <w:sz w:val="22"/>
+          <w:szCs w:val="22"/>
         </w:rPr>
         <w:commentReference w:id="29"/>
       </w:r>
@@ -2583,21 +2664,7 @@
         <w:rPr>
           <w:color w:val="000000" w:themeColor="text1"/>
         </w:rPr>
-        <w:t xml:space="preserve">Together, these methodologies emphasize process guidance with room for employee-driven adaptation. Each of these methodologies values process structure, but they also underscore the importance of executive support, managerial design, and employee ownership over results. Whether through Lean’s continuous improvement, </w:t>
-      </w:r>
-      <w:proofErr w:type="spellStart"/>
-      <w:r>
-        <w:rPr>
-          <w:color w:val="000000" w:themeColor="text1"/>
-        </w:rPr>
-        <w:t>Agile’s</w:t>
-      </w:r>
-      <w:proofErr w:type="spellEnd"/>
-      <w:r>
-        <w:rPr>
-          <w:color w:val="000000" w:themeColor="text1"/>
-        </w:rPr>
-        <w:t xml:space="preserve"> flexibility, or ITIL’s focus </w:t>
+        <w:t xml:space="preserve">Together, these methodologies emphasize process guidance with room for employee-driven adaptation. Each of these methodologies values process structure, but they also underscore the importance of executive support, managerial design, and employee ownership over results. Whether through Lean’s continuous improvement, Agile’s flexibility, or ITIL’s focus </w:t>
       </w:r>
       <w:r>
         <w:rPr>
@@ -3429,6 +3496,12 @@
       </w:r>
       <w:commentRangeEnd w:id="30"/>
       <w:r>
+        <w:rPr>
+          <w:rStyle w:val="CommentReference"/>
+          <w:rFonts w:ascii="Cambria" w:eastAsia="Cambria" w:hAnsi="Cambria" w:cs="Cambria"/>
+          <w:sz w:val="22"/>
+          <w:szCs w:val="22"/>
+        </w:rPr>
         <w:commentReference w:id="30"/>
       </w:r>
     </w:p>
@@ -3649,6 +3722,12 @@
       </w:r>
       <w:commentRangeEnd w:id="31"/>
       <w:r>
+        <w:rPr>
+          <w:rStyle w:val="CommentReference"/>
+          <w:rFonts w:ascii="Cambria" w:eastAsia="Cambria" w:hAnsi="Cambria" w:cs="Cambria"/>
+          <w:sz w:val="22"/>
+          <w:szCs w:val="22"/>
+        </w:rPr>
         <w:commentReference w:id="31"/>
       </w:r>
       <w:r>
@@ -4111,6 +4190,12 @@
       </w:r>
       <w:commentRangeEnd w:id="32"/>
       <w:r>
+        <w:rPr>
+          <w:rStyle w:val="CommentReference"/>
+          <w:rFonts w:ascii="Cambria" w:eastAsia="Cambria" w:hAnsi="Cambria" w:cs="Cambria"/>
+          <w:sz w:val="22"/>
+          <w:szCs w:val="22"/>
+        </w:rPr>
         <w:commentReference w:id="32"/>
       </w:r>
     </w:p>
@@ -4471,6 +4556,12 @@
       </w:r>
       <w:commentRangeEnd w:id="33"/>
       <w:r>
+        <w:rPr>
+          <w:rStyle w:val="CommentReference"/>
+          <w:rFonts w:ascii="Cambria" w:eastAsia="Cambria" w:hAnsi="Cambria" w:cs="Cambria"/>
+          <w:sz w:val="22"/>
+          <w:szCs w:val="22"/>
+        </w:rPr>
         <w:commentReference w:id="33"/>
       </w:r>
     </w:p>
@@ -5020,6 +5111,12 @@
       </w:r>
       <w:commentRangeEnd w:id="34"/>
       <w:r>
+        <w:rPr>
+          <w:rStyle w:val="CommentReference"/>
+          <w:rFonts w:ascii="Cambria" w:eastAsia="Cambria" w:hAnsi="Cambria" w:cs="Cambria"/>
+          <w:sz w:val="22"/>
+          <w:szCs w:val="22"/>
+        </w:rPr>
         <w:commentReference w:id="34"/>
       </w:r>
     </w:p>
@@ -5364,21 +5461,7 @@
         <w:rPr>
           <w:rFonts w:ascii="Cambria" w:eastAsia="Cambria" w:hAnsi="Cambria" w:cs="Cambria"/>
         </w:rPr>
-        <w:t xml:space="preserve">: Platforms like </w:t>
-      </w:r>
-      <w:proofErr w:type="spellStart"/>
-      <w:r>
-        <w:rPr>
-          <w:rFonts w:ascii="Cambria" w:eastAsia="Cambria" w:hAnsi="Cambria" w:cs="Cambria"/>
-        </w:rPr>
-        <w:t>Officevibe</w:t>
-      </w:r>
-      <w:proofErr w:type="spellEnd"/>
-      <w:r>
-        <w:rPr>
-          <w:rFonts w:ascii="Cambria" w:eastAsia="Cambria" w:hAnsi="Cambria" w:cs="Cambria"/>
-        </w:rPr>
-        <w:t xml:space="preserve"> provide a safe way for employees to voice concerns while enabling leaders to track </w:t>
+        <w:t xml:space="preserve">: Platforms like Officevibe provide a safe way for employees to voice concerns while enabling leaders to track </w:t>
       </w:r>
       <w:r>
         <w:rPr>
@@ -8215,21 +8298,7 @@
         <w:rPr>
           <w:rFonts w:ascii="Cambria" w:eastAsia="Cambria" w:hAnsi="Cambria" w:cs="Cambria"/>
         </w:rPr>
-        <w:t xml:space="preserve"> phase, the team clearly articulates the issue at hand, the stakeholders involved, and the desired outcome. This step often includes scoping the problem to ensure </w:t>
-      </w:r>
-      <w:proofErr w:type="spellStart"/>
-      <w:r>
-        <w:rPr>
-          <w:rFonts w:ascii="Cambria" w:eastAsia="Cambria" w:hAnsi="Cambria" w:cs="Cambria"/>
-        </w:rPr>
-        <w:t>it’s</w:t>
-      </w:r>
-      <w:proofErr w:type="spellEnd"/>
-      <w:r>
-        <w:rPr>
-          <w:rFonts w:ascii="Cambria" w:eastAsia="Cambria" w:hAnsi="Cambria" w:cs="Cambria"/>
-        </w:rPr>
-        <w:t xml:space="preserve"> manageable and setting goals that are specific, measurable, and aligned with organizational priorities.</w:t>
+        <w:t xml:space="preserve"> phase, the team clearly articulates the issue at hand, the stakeholders involved, and the desired outcome. This step often includes scoping the problem to ensure it’s manageable and setting goals that are specific, measurable, and aligned with organizational priorities.</w:t>
       </w:r>
     </w:p>
     <w:p>
@@ -11688,15 +11757,7 @@
     </w:p>
     <w:p>
       <w:r>
-        <w:t xml:space="preserve">Carmen explains the impact of automation. “Every time you manually reset a password, it takes about 5 minutes. Multiply that by hundreds of tickets per week, and you’re wasting hours on something a </w:t>
-      </w:r>
-      <w:proofErr w:type="spellStart"/>
-      <w:r>
-        <w:t>bot</w:t>
-      </w:r>
-      <w:proofErr w:type="spellEnd"/>
-      <w:r>
-        <w:t xml:space="preserve"> could do.”</w:t>
+        <w:t>Carmen explains the impact of automation. “Every time you manually reset a password, it takes about 5 minutes. Multiply that by hundreds of tickets per week, and you’re wasting hours on something a bot could do.”</w:t>
       </w:r>
     </w:p>
     <w:p>
@@ -14290,23 +14351,13 @@
           <w:bCs/>
         </w:rPr>
       </w:pPr>
-      <w:proofErr w:type="spellStart"/>
-      <w:r>
-        <w:rPr>
-          <w:rFonts w:ascii="Cambria" w:eastAsia="Cambria" w:hAnsi="Cambria" w:cs="Cambria"/>
-          <w:b/>
-          <w:bCs/>
-        </w:rPr>
-        <w:t>Agile’s</w:t>
-      </w:r>
-      <w:proofErr w:type="spellEnd"/>
-      <w:r>
-        <w:rPr>
-          <w:rFonts w:ascii="Cambria" w:eastAsia="Cambria" w:hAnsi="Cambria" w:cs="Cambria"/>
-          <w:b/>
-          <w:bCs/>
-        </w:rPr>
-        <w:t xml:space="preserve"> Biggest Myths (and Why They’re Wrong)</w:t>
+      <w:r>
+        <w:rPr>
+          <w:rFonts w:ascii="Cambria" w:eastAsia="Cambria" w:hAnsi="Cambria" w:cs="Cambria"/>
+          <w:b/>
+          <w:bCs/>
+        </w:rPr>
+        <w:t>Agile’s Biggest Myths (and Why They’re Wrong)</w:t>
       </w:r>
     </w:p>
     <w:p>
@@ -15328,21 +15379,7 @@
         <w:rPr>
           <w:rFonts w:ascii="Cambria" w:eastAsia="Cambria" w:hAnsi="Cambria" w:cs="Cambria"/>
         </w:rPr>
-        <w:t xml:space="preserve">AI-powered backlog tools (like Jira Advanced Roadmaps or </w:t>
-      </w:r>
-      <w:proofErr w:type="spellStart"/>
-      <w:r>
-        <w:rPr>
-          <w:rFonts w:ascii="Cambria" w:eastAsia="Cambria" w:hAnsi="Cambria" w:cs="Cambria"/>
-        </w:rPr>
-        <w:t>ClickUp’s</w:t>
-      </w:r>
-      <w:proofErr w:type="spellEnd"/>
-      <w:r>
-        <w:rPr>
-          <w:rFonts w:ascii="Cambria" w:eastAsia="Cambria" w:hAnsi="Cambria" w:cs="Cambria"/>
-        </w:rPr>
-        <w:t xml:space="preserve"> AI-driven prioritization) analyze historical data, customer feedback, and team velocity to rank tasks based on real impact.</w:t>
+        <w:t>AI-powered backlog tools (like Jira Advanced Roadmaps or ClickUp’s AI-driven prioritization) analyze historical data, customer feedback, and team velocity to rank tasks based on real impact.</w:t>
       </w:r>
     </w:p>
     <w:p>
@@ -15507,21 +15544,7 @@
         <w:rPr>
           <w:rFonts w:ascii="Cambria" w:eastAsia="Cambria" w:hAnsi="Cambria" w:cs="Cambria"/>
         </w:rPr>
-        <w:t xml:space="preserve">CI/CD pipelines with AI integration (Jenkins, </w:t>
-      </w:r>
-      <w:proofErr w:type="spellStart"/>
-      <w:r>
-        <w:rPr>
-          <w:rFonts w:ascii="Cambria" w:eastAsia="Cambria" w:hAnsi="Cambria" w:cs="Cambria"/>
-        </w:rPr>
-        <w:t>CircleCI</w:t>
-      </w:r>
-      <w:proofErr w:type="spellEnd"/>
-      <w:r>
-        <w:rPr>
-          <w:rFonts w:ascii="Cambria" w:eastAsia="Cambria" w:hAnsi="Cambria" w:cs="Cambria"/>
-        </w:rPr>
-        <w:t>) ensure that as soon as code is committed, it’s automatically tested, built, and deployed, reducing manual intervention and human error.</w:t>
+        <w:t>CI/CD pipelines with AI integration (Jenkins, CircleCI) ensure that as soon as code is committed, it’s automatically tested, built, and deployed, reducing manual intervention and human error.</w:t>
       </w:r>
     </w:p>
     <w:p>
@@ -15782,21 +15805,7 @@
         <w:rPr>
           <w:rFonts w:ascii="Cambria" w:eastAsia="Cambria" w:hAnsi="Cambria" w:cs="Cambria"/>
         </w:rPr>
-        <w:t xml:space="preserve">AI-powered sentiment analysis tools, such as </w:t>
-      </w:r>
-      <w:proofErr w:type="spellStart"/>
-      <w:r>
-        <w:rPr>
-          <w:rFonts w:ascii="Cambria" w:eastAsia="Cambria" w:hAnsi="Cambria" w:cs="Cambria"/>
-        </w:rPr>
-        <w:t>Officevibe</w:t>
-      </w:r>
-      <w:proofErr w:type="spellEnd"/>
-      <w:r>
-        <w:rPr>
-          <w:rFonts w:ascii="Cambria" w:eastAsia="Cambria" w:hAnsi="Cambria" w:cs="Cambria"/>
-        </w:rPr>
-        <w:t xml:space="preserve"> or Microsoft Viva, analyze team messages, sprint feedback, and survey responses to detect signs of burnout, disengagement, or frustration.</w:t>
+        <w:t>AI-powered sentiment analysis tools, such as Officevibe or Microsoft Viva, analyze team messages, sprint feedback, and survey responses to detect signs of burnout, disengagement, or frustration.</w:t>
       </w:r>
     </w:p>
     <w:p>
@@ -16061,21 +16070,7 @@
         <w:rPr>
           <w:rFonts w:ascii="Cambria" w:eastAsia="Cambria" w:hAnsi="Cambria" w:cs="Cambria"/>
         </w:rPr>
-        <w:t xml:space="preserve">The best Agile teams will embrace AI as a tool, but stay focused on </w:t>
-      </w:r>
-      <w:proofErr w:type="spellStart"/>
-      <w:r>
-        <w:rPr>
-          <w:rFonts w:ascii="Cambria" w:eastAsia="Cambria" w:hAnsi="Cambria" w:cs="Cambria"/>
-        </w:rPr>
-        <w:t>Agile’s</w:t>
-      </w:r>
-      <w:proofErr w:type="spellEnd"/>
-      <w:r>
-        <w:rPr>
-          <w:rFonts w:ascii="Cambria" w:eastAsia="Cambria" w:hAnsi="Cambria" w:cs="Cambria"/>
-        </w:rPr>
-        <w:t xml:space="preserve"> core principles: adaptability, collaboration, and delivering value.</w:t>
+        <w:t>The best Agile teams will embrace AI as a tool, but stay focused on Agile’s core principles: adaptability, collaboration, and delivering value.</w:t>
       </w:r>
     </w:p>
     <w:p>
@@ -18367,21 +18362,7 @@
         <w:rPr>
           <w:rFonts w:ascii="Cambria" w:eastAsia="Cambria" w:hAnsi="Cambria" w:cs="Cambria"/>
         </w:rPr>
-        <w:t xml:space="preserve">When priorities shift in your team, how does work actually get adjusted? Are changes deliberate, or do they create chaos? How would </w:t>
-      </w:r>
-      <w:proofErr w:type="spellStart"/>
-      <w:r>
-        <w:rPr>
-          <w:rFonts w:ascii="Cambria" w:eastAsia="Cambria" w:hAnsi="Cambria" w:cs="Cambria"/>
-        </w:rPr>
-        <w:t>Agile’s</w:t>
-      </w:r>
-      <w:proofErr w:type="spellEnd"/>
-      <w:r>
-        <w:rPr>
-          <w:rFonts w:ascii="Cambria" w:eastAsia="Cambria" w:hAnsi="Cambria" w:cs="Cambria"/>
-        </w:rPr>
-        <w:t xml:space="preserve"> iterative approach change that?</w:t>
+        <w:t>When priorities shift in your team, how does work actually get adjusted? Are changes deliberate, or do they create chaos? How would Agile’s iterative approach change that?</w:t>
       </w:r>
     </w:p>
     <w:p>
@@ -18511,25 +18492,7 @@
           <w:b/>
           <w:bCs/>
         </w:rPr>
-        <w:t xml:space="preserve">The support team at </w:t>
-      </w:r>
-      <w:proofErr w:type="spellStart"/>
-      <w:r>
-        <w:rPr>
-          <w:rFonts w:ascii="Cambria" w:eastAsia="Cambria" w:hAnsi="Cambria" w:cs="Cambria"/>
-          <w:b/>
-          <w:bCs/>
-        </w:rPr>
-        <w:t>InnovateTech</w:t>
-      </w:r>
-      <w:proofErr w:type="spellEnd"/>
-      <w:r>
-        <w:rPr>
-          <w:rFonts w:ascii="Cambria" w:eastAsia="Cambria" w:hAnsi="Cambria" w:cs="Cambria"/>
-          <w:b/>
-          <w:bCs/>
-        </w:rPr>
-        <w:t xml:space="preserve"> was in over their heads. Every day felt like a battle against an endless stream of incidents. Outages, system slowdowns, and security breaches were constant, and every fix felt temporary. Their biggest customer had just threatened to pull out of a major contract due to repeated downtime, and leadership demanded answers.</w:t>
+        <w:t>The support team at InnovateTech was in over their heads. Every day felt like a battle against an endless stream of incidents. Outages, system slowdowns, and security breaches were constant, and every fix felt temporary. Their biggest customer had just threatened to pull out of a major contract due to repeated downtime, and leadership demanded answers.</w:t>
       </w:r>
     </w:p>
     <w:p>
@@ -19343,25 +19306,7 @@
           <w:b/>
           <w:bCs/>
         </w:rPr>
-        <w:t xml:space="preserve">A few months after implementing ITIL, </w:t>
-      </w:r>
-      <w:proofErr w:type="spellStart"/>
-      <w:r>
-        <w:rPr>
-          <w:rFonts w:ascii="Cambria" w:eastAsia="Cambria" w:hAnsi="Cambria" w:cs="Cambria"/>
-          <w:b/>
-          <w:bCs/>
-        </w:rPr>
-        <w:t>InnovateTech’s</w:t>
-      </w:r>
-      <w:proofErr w:type="spellEnd"/>
-      <w:r>
-        <w:rPr>
-          <w:rFonts w:ascii="Cambria" w:eastAsia="Cambria" w:hAnsi="Cambria" w:cs="Cambria"/>
-          <w:b/>
-          <w:bCs/>
-        </w:rPr>
-        <w:t xml:space="preserve"> IT team saw a dramatic shift:</w:t>
+        <w:t>A few months after implementing ITIL, InnovateTech’s IT team saw a dramatic shift:</w:t>
       </w:r>
     </w:p>
     <w:p>
@@ -25530,23 +25475,13 @@
           <w:rFonts w:ascii="Cambria" w:eastAsia="Cambria" w:hAnsi="Cambria" w:cs="Cambria"/>
         </w:rPr>
       </w:pPr>
-      <w:proofErr w:type="spellStart"/>
-      <w:r>
-        <w:rPr>
-          <w:rFonts w:ascii="Cambria" w:eastAsia="Cambria" w:hAnsi="Cambria" w:cs="Cambria"/>
-          <w:b/>
-          <w:bCs/>
-        </w:rPr>
-        <w:t>Agile’s</w:t>
-      </w:r>
-      <w:proofErr w:type="spellEnd"/>
-      <w:r>
-        <w:rPr>
-          <w:rFonts w:ascii="Cambria" w:eastAsia="Cambria" w:hAnsi="Cambria" w:cs="Cambria"/>
-          <w:b/>
-          <w:bCs/>
-        </w:rPr>
-        <w:t xml:space="preserve"> goal</w:t>
+      <w:r>
+        <w:rPr>
+          <w:rFonts w:ascii="Cambria" w:eastAsia="Cambria" w:hAnsi="Cambria" w:cs="Cambria"/>
+          <w:b/>
+          <w:bCs/>
+        </w:rPr>
+        <w:t>Agile’s goal</w:t>
       </w:r>
       <w:r>
         <w:rPr>
@@ -27276,23 +27211,13 @@
           <w:rFonts w:ascii="Cambria" w:eastAsia="Cambria" w:hAnsi="Cambria" w:cs="Cambria"/>
         </w:rPr>
       </w:pPr>
-      <w:proofErr w:type="spellStart"/>
-      <w:r>
-        <w:rPr>
-          <w:rFonts w:ascii="Cambria" w:eastAsia="Cambria" w:hAnsi="Cambria" w:cs="Cambria"/>
-          <w:b/>
-          <w:bCs/>
-        </w:rPr>
-        <w:t>Agile’s</w:t>
-      </w:r>
-      <w:proofErr w:type="spellEnd"/>
-      <w:r>
-        <w:rPr>
-          <w:rFonts w:ascii="Cambria" w:eastAsia="Cambria" w:hAnsi="Cambria" w:cs="Cambria"/>
-          <w:b/>
-          <w:bCs/>
-        </w:rPr>
-        <w:t xml:space="preserve"> Retrospective Principle:</w:t>
+      <w:r>
+        <w:rPr>
+          <w:rFonts w:ascii="Cambria" w:eastAsia="Cambria" w:hAnsi="Cambria" w:cs="Cambria"/>
+          <w:b/>
+          <w:bCs/>
+        </w:rPr>
+        <w:t>Agile’s Retrospective Principle:</w:t>
       </w:r>
       <w:r>
         <w:rPr>

</xml_diff>